<commit_message>
Repair C4 parser-owned comment association
</commit_message>
<xml_diff>
--- a/test/fixtures/revision-bridge/google-c4-native-review-returned.docx
+++ b/test/fixtures/revision-bridge/google-c4-native-review-returned.docx
@@ -14,7 +14,7 @@
         </w:rPr>
         <w:t xml:space="preserve">[plainTextPreserved] Body text </w:t>
       </w:r>
-      <w:ins w:author="Кирилл Пономарев" w:id="0" w:date="2026-09-15T02:15:37Z">
+      <w:ins w:author="Yalken Reviewer0" w:id="0" w:date="2026-09-15T02:15:37Z">
         <w:commentRangeStart w:id="0"/>
         <w:r>
           <w:rPr>
@@ -33,7 +33,7 @@
           <w:t xml:space="preserve">a</w:t>
         </w:r>
       </w:ins>
-      <w:del w:author="Кирилл Пономарев" w:id="0" w:date="2026-09-15T02:15:37Z">
+      <w:del w:author="Yalken Reviewer0" w:id="0" w:date="2026-09-15T02:15:37Z">
         <w:r>
           <w:rPr>
             <w:rtl w:val="0"/>
@@ -295,7 +295,7 @@
 
 <file path=word/comments.xml><?xml version="1.0" encoding="utf-8"?>
 <w:comments xmlns:mc="http://schemas.openxmlformats.org/markup-compatibility/2006" xmlns:o="urn:schemas-microsoft-com:office:office" xmlns:r="http://schemas.openxmlformats.org/officeDocument/2006/relationships" xmlns:m="http://schemas.openxmlformats.org/officeDocument/2006/math" xmlns:v="urn:schemas-microsoft-com:vml" xmlns:wp="http://schemas.openxmlformats.org/drawingml/2006/wordprocessingDrawing" xmlns:w10="urn:schemas-microsoft-com:office:word" xmlns:w="http://schemas.openxmlformats.org/wordprocessingml/2006/main" xmlns:wne="http://schemas.microsoft.com/office/word/2006/wordml" xmlns:sl="http://schemas.openxmlformats.org/schemaLibrary/2006/main" xmlns:a="http://schemas.openxmlformats.org/drawingml/2006/main" xmlns:pic="http://schemas.openxmlformats.org/drawingml/2006/picture" xmlns:c="http://schemas.openxmlformats.org/drawingml/2006/chart" xmlns:lc="http://schemas.openxmlformats.org/drawingml/2006/lockedCanvas" xmlns:dgm="http://schemas.openxmlformats.org/drawingml/2006/diagram" xmlns:wps="http://schemas.microsoft.com/office/word/2010/wordprocessingShape" xmlns:wpg="http://schemas.microsoft.com/office/word/2010/wordprocessingGroup" xmlns:w14="http://schemas.microsoft.com/office/word/2010/wordml" xmlns:w15="http://schemas.microsoft.com/office/word/2012/wordml" xmlns:w16="http://schemas.microsoft.com/office/word/2018/wordml" xmlns:w16cex="http://schemas.microsoft.com/office/word/2018/wordml/cex" xmlns:w16cid="http://schemas.microsoft.com/office/word/2016/wordml/cid" xmlns="http://schemas.microsoft.com/office/tasks/2019/documenttasks" xmlns:cr="http://schemas.microsoft.com/office/comments/2020/reactions">
-  <w:comment w:author="Кирилл Пономарев" w:id="0" w:date="2026-09-15T02:15:56Z">
+  <w:comment w:author="Yalken Reviewer0" w:id="0" w:date="2026-09-15T02:15:56Z">
     <w:p>
       <w:pPr>
         <w:keepNext w:val="0"/>

</xml_diff>